<commit_message>
v0.6.18: reorder sections, Control Panel Notes field, drop Top's Import
- Section order: Section 1: Elevator Info -> 4.0 Elevator Integration
  Checks (2nd) -> Railing Measurements (3rd) -> 3. Technical Findings
  -> 5. Photos -> 1.1 Elevator Assessment (now last, checked at the
  end of the visit) -> Finish.
- New Notes textarea (panel_note) right before Control Panel Photos,
  wired into docxData and added to template.docx (via python-docx,
  inserted before the {#photos} loop start so it isn't caught inside
  the loop) so it actually prints in the exported report.
- Top railing's tpl-bar drops the 'Import from desktop' button/box --
  it ships with a locked photo already, doesn't need it. Other rails
  keep it unchanged.

Co-Authored-By: Claude Sonnet 5 <noreply@anthropic.com>
Claude-Session: https://claude.ai/code/session_01FumjKuHqb2hcHBnB6rY5cR
</commit_message>
<xml_diff>
--- a/template.docx
+++ b/template.docx
@@ -9920,6 +9920,21 @@
           <w:cols w:space="720"/>
         </w:sectPr>
       </w:pPr>
+    </w:p>
+    <w:p>
+      <w:r>
+        <w:rPr>
+          <w:b/>
+          <w:sz w:val="18"/>
+        </w:rPr>
+        <w:t xml:space="preserve">Control Panel Notes: </w:t>
+      </w:r>
+      <w:r>
+        <w:rPr>
+          <w:sz w:val="18"/>
+        </w:rPr>
+        <w:t>{panel_note}</w:t>
+      </w:r>
     </w:p>
     <w:p>
       <w:pPr>

</xml_diff>

<commit_message>
v0.6.41: railing drawings and photos now actually appear in the report
The .docx only ever carried text: railing dims were numbers in a table
and photos were just filenames -- no picture ever reached the file.
Added the free docxtemplater image module, a new 'Railing drawings'
section in template.docx ({#rail_imgs} -> name, {%img}, dims line),
and {%p_img} in the photos table. Each rail's live SVG board is
rasterised to a 2x PNG at export time; photos ride their stored data
URL. Sizes keep each picture's own proportions.

Co-Authored-By: Claude Opus 5 <noreply@anthropic.com>
Claude-Session: https://claude.ai/code/session_01FumjKuHqb2hcHBnB6rY5cR
</commit_message>
<xml_diff>
--- a/template.docx
+++ b/template.docx
@@ -4216,6 +4216,44 @@
         </w:tc>
       </w:tr>
     </w:tbl>
+    <w:p/>
+    <w:p>
+      <w:r>
+        <w:rPr>
+          <w:b/>
+        </w:rPr>
+        <w:t>Railing drawings</w:t>
+      </w:r>
+    </w:p>
+    <w:p>
+      <w:r>
+        <w:t>{#rail_imgs}</w:t>
+      </w:r>
+    </w:p>
+    <w:p>
+      <w:r>
+        <w:rPr>
+          <w:b/>
+        </w:rPr>
+        <w:t>{railing}</w:t>
+      </w:r>
+    </w:p>
+    <w:p>
+      <w:r>
+        <w:t>{%img}</w:t>
+      </w:r>
+    </w:p>
+    <w:p>
+      <w:r>
+        <w:t>{dims_line}</w:t>
+      </w:r>
+    </w:p>
+    <w:p>
+      <w:r>
+        <w:t>{/rail_imgs}</w:t>
+      </w:r>
+    </w:p>
+    <w:p/>
     <w:p>
       <w:r>
         <w:t xml:space="preserve">Notes: {rail_note}</w:t>
@@ -10174,6 +10212,11 @@
                   </a:graphic>
                 </wp:inline>
               </w:drawing>
+            </w:r>
+          </w:p>
+          <w:p>
+            <w:r>
+              <w:t>{%p_img}</w:t>
             </w:r>
           </w:p>
         </w:tc>

</xml_diff>

<commit_message>
v0.6.42: embed report pictures without the image module
v0.6.41 died on device with 'Fill failed: Cannot set property
namespaceURI of #<Element> which has only a getter' -- the free
docxtemplater image module writes to a read-only DOM property and
can't run against docxtemplater v4 + a real browser DOM.

Dropped the module. Picture tags are plain text tags now that render
an @@IMGn@@ marker; after render we put the PNGs into word/media,
add a relationship each, register the png content type, and swap each
marker's <w:t> for a <w:drawing>. Verified headless: images embedded,
relationships resolve, no markers left, file opens clean.

Co-Authored-By: Claude Opus 5 <noreply@anthropic.com>
Claude-Session: https://claude.ai/code/session_01FumjKuHqb2hcHBnB6rY5cR
</commit_message>
<xml_diff>
--- a/template.docx
+++ b/template.docx
@@ -4240,7 +4240,7 @@
     </w:p>
     <w:p>
       <w:r>
-        <w:t>{%img}</w:t>
+        <w:t>{img}</w:t>
       </w:r>
     </w:p>
     <w:p>
@@ -10216,7 +10216,7 @@
           </w:p>
           <w:p>
             <w:r>
-              <w:t>{%p_img}</w:t>
+              <w:t>{p_img}</w:t>
             </w:r>
           </w:p>
         </w:tc>

</xml_diff>

<commit_message>
v0.6.45: frequency reaches the report; exports stop overwriting each other
Frequency was collected per reading and passed to the template as
du_freq/et_freq, but template.docx had no placeholder for it, so it
was dropped on every report ever generated. The Band column in all
three RF tables now carries the frequency on a second line.

Exports also only ever existed as one cache file under a fixed name:
each report overwrote the previous one, and the cache can be cleared
by the system at any time. Reports now save to the phone's Downloads
folder as well (MediaStore on Android 10+, no permission needed) and
carry a date-time stamp in the filename, and the app reports where it
put the file.

Co-Authored-By: Claude Opus 5 <noreply@anthropic.com>
Claude-Session: https://claude.ai/code/session_01FumjKuHqb2hcHBnB6rY5cR
</commit_message>
<xml_diff>
--- a/template.docx
+++ b/template.docx
@@ -5430,7 +5430,9 @@
                 <w:w w:val="125"/>
                 <w:sz w:val="15"/>
               </w:rPr>
-              <w:t>Band</w:t>
+              <w:t>Band /</w:t>
+              <w:br/>
+              <w:t>Freq</w:t>
             </w:r>
           </w:p>
         </w:tc>
@@ -5678,7 +5680,9 @@
                 <w:w w:val="125"/>
                 <w:sz w:val="15"/>
               </w:rPr>
-              <w:t>Band</w:t>
+              <w:t>Band /</w:t>
+              <w:br/>
+              <w:t>Freq</w:t>
             </w:r>
           </w:p>
         </w:tc>
@@ -5942,6 +5946,24 @@
               <w:t>{du_band}</w:t>
             </w:r>
           </w:p>
+          <w:p>
+            <w:pPr>
+              <w:pStyle w:val="TableParagraph"/>
+              <w:ind w:left="99"/>
+              <w:rPr>
+                <w:sz w:val="15"/>
+              </w:rPr>
+            </w:pPr>
+            <w:r>
+              <w:rPr>
+                <w:color w:val="1F2836"/>
+                <w:spacing w:val="-5"/>
+                <w:w w:val="110"/>
+                <w:sz w:val="15"/>
+              </w:rPr>
+              <w:t>{du_freq}</w:t>
+            </w:r>
+          </w:p>
         </w:tc>
         <w:tc>
           <w:tcPr>
@@ -6096,6 +6118,24 @@
                 <w:sz w:val="15"/>
               </w:rPr>
               <w:t>{et_band}</w:t>
+            </w:r>
+          </w:p>
+          <w:p>
+            <w:pPr>
+              <w:pStyle w:val="TableParagraph"/>
+              <w:ind w:left="96"/>
+              <w:rPr>
+                <w:sz w:val="15"/>
+              </w:rPr>
+            </w:pPr>
+            <w:r>
+              <w:rPr>
+                <w:color w:val="1F2836"/>
+                <w:spacing w:val="-5"/>
+                <w:w w:val="110"/>
+                <w:sz w:val="15"/>
+              </w:rPr>
+              <w:t>{et_freq}</w:t>
             </w:r>
           </w:p>
         </w:tc>
@@ -6801,7 +6841,9 @@
                 <w:w w:val="125"/>
                 <w:sz w:val="15"/>
               </w:rPr>
-              <w:t>Band</w:t>
+              <w:t>Band /</w:t>
+              <w:br/>
+              <w:t>Freq</w:t>
             </w:r>
           </w:p>
         </w:tc>
@@ -7049,7 +7091,9 @@
                 <w:w w:val="125"/>
                 <w:sz w:val="15"/>
               </w:rPr>
-              <w:t>Band</w:t>
+              <w:t>Band /</w:t>
+              <w:br/>
+              <w:t>Freq</w:t>
             </w:r>
           </w:p>
         </w:tc>
@@ -7281,6 +7325,24 @@
               <w:t>{du_band}</w:t>
             </w:r>
           </w:p>
+          <w:p>
+            <w:pPr>
+              <w:pStyle w:val="TableParagraph"/>
+              <w:ind w:left="99"/>
+              <w:rPr>
+                <w:sz w:val="15"/>
+              </w:rPr>
+            </w:pPr>
+            <w:r>
+              <w:rPr>
+                <w:color w:val="1F2836"/>
+                <w:spacing w:val="-5"/>
+                <w:w w:val="110"/>
+                <w:sz w:val="15"/>
+              </w:rPr>
+              <w:t>{du_freq}</w:t>
+            </w:r>
+          </w:p>
         </w:tc>
         <w:tc>
           <w:tcPr>
@@ -7435,6 +7497,24 @@
                 <w:sz w:val="15"/>
               </w:rPr>
               <w:t>{et_band}</w:t>
+            </w:r>
+          </w:p>
+          <w:p>
+            <w:pPr>
+              <w:pStyle w:val="TableParagraph"/>
+              <w:ind w:left="96"/>
+              <w:rPr>
+                <w:sz w:val="15"/>
+              </w:rPr>
+            </w:pPr>
+            <w:r>
+              <w:rPr>
+                <w:color w:val="1F2836"/>
+                <w:spacing w:val="-5"/>
+                <w:w w:val="110"/>
+                <w:sz w:val="15"/>
+              </w:rPr>
+              <w:t>{et_freq}</w:t>
             </w:r>
           </w:p>
         </w:tc>
@@ -8054,7 +8134,9 @@
                 <w:w w:val="125"/>
                 <w:sz w:val="15"/>
               </w:rPr>
-              <w:t>Band</w:t>
+              <w:t>Band /</w:t>
+              <w:br/>
+              <w:t>Freq</w:t>
             </w:r>
           </w:p>
         </w:tc>
@@ -8302,7 +8384,9 @@
                 <w:w w:val="125"/>
                 <w:sz w:val="15"/>
               </w:rPr>
-              <w:t>Band</w:t>
+              <w:t>Band /</w:t>
+              <w:br/>
+              <w:t>Freq</w:t>
             </w:r>
           </w:p>
         </w:tc>
@@ -8529,6 +8613,25 @@
               <w:t>{du_band}</w:t>
             </w:r>
           </w:p>
+          <w:p>
+            <w:pPr>
+              <w:pStyle w:val="TableParagraph"/>
+              <w:spacing w:before="78"/>
+              <w:ind w:left="99"/>
+              <w:rPr>
+                <w:sz w:val="15"/>
+              </w:rPr>
+            </w:pPr>
+            <w:r>
+              <w:rPr>
+                <w:color w:val="1F2836"/>
+                <w:spacing w:val="-5"/>
+                <w:w w:val="110"/>
+                <w:sz w:val="15"/>
+              </w:rPr>
+              <w:t>{du_freq}</w:t>
+            </w:r>
+          </w:p>
         </w:tc>
         <w:tc>
           <w:tcPr>
@@ -8674,6 +8777,25 @@
                 <w:sz w:val="15"/>
               </w:rPr>
               <w:t>{et_band}</w:t>
+            </w:r>
+          </w:p>
+          <w:p>
+            <w:pPr>
+              <w:pStyle w:val="TableParagraph"/>
+              <w:spacing w:before="78"/>
+              <w:ind w:left="96"/>
+              <w:rPr>
+                <w:sz w:val="15"/>
+              </w:rPr>
+            </w:pPr>
+            <w:r>
+              <w:rPr>
+                <w:color w:val="1F2836"/>
+                <w:spacing w:val="-5"/>
+                <w:w w:val="110"/>
+                <w:sz w:val="15"/>
+              </w:rPr>
+              <w:t>{et_freq}</w:t>
             </w:r>
           </w:p>
         </w:tc>

</xml_diff>

<commit_message>
v0.6.46: Band and Freq get their own columns in the RF tables
v0.6.45 stacked the frequency under the band in one cell; they are
separate readings and belong in separate columns. All three RF tables
now run Band | Freq (MHz) side by side (15 columns), with the carrier
banner widened to match.

Co-Authored-By: Claude Opus 5 <noreply@anthropic.com>
Claude-Session: https://claude.ai/code/session_01FumjKuHqb2hcHBnB6rY5cR
</commit_message>
<xml_diff>
--- a/template.docx
+++ b/template.docx
@@ -5024,6 +5024,8 @@
         <w:gridCol w:w="694"/>
         <w:gridCol w:w="790"/>
         <w:gridCol w:w="792"/>
+        <w:gridCol w:w="694"/>
+        <w:gridCol w:w="696"/>
       </w:tblGrid>
       <w:tr>
         <w:trPr>
@@ -5092,7 +5094,7 @@
         <w:tc>
           <w:tcPr>
             <w:tcW w:w="4409" w:type="dxa"/>
-            <w:gridSpan w:val="6"/>
+            <w:gridSpan w:val="7"/>
             <w:tcBorders>
               <w:top w:val="nil"/>
             </w:tcBorders>
@@ -5174,7 +5176,7 @@
         <w:tc>
           <w:tcPr>
             <w:tcW w:w="4413" w:type="dxa"/>
-            <w:gridSpan w:val="6"/>
+            <w:gridSpan w:val="7"/>
             <w:tcBorders>
               <w:top w:val="nil"/>
             </w:tcBorders>
@@ -5430,9 +5432,35 @@
                 <w:w w:val="125"/>
                 <w:sz w:val="15"/>
               </w:rPr>
-              <w:t>Band /</w:t>
               <w:br/>
-              <w:t>Freq</w:t>
+              <w:t xml:space="preserve">Band</w:t>
+            </w:r>
+          </w:p>
+        </w:tc>
+        <w:tc>
+          <w:tcPr>
+            <w:tcW w:w="696" w:type="dxa"/>
+            <w:shd w:val="clear" w:color="auto" w:fill="EEEEEE"/>
+          </w:tcPr>
+          <w:p>
+            <w:pPr>
+              <w:pStyle w:val="TableParagraph"/>
+              <w:spacing w:before="61"/>
+              <w:ind w:left="133"/>
+              <w:rPr>
+                <w:b/>
+                <w:sz w:val="15"/>
+              </w:rPr>
+            </w:pPr>
+            <w:r>
+              <w:rPr>
+                <w:b/>
+                <w:spacing w:val="-4"/>
+                <w:w w:val="125"/>
+                <w:sz w:val="15"/>
+              </w:rPr>
+              <w:br/>
+              <w:t xml:space="preserve">Freq (MHz)</w:t>
             </w:r>
           </w:p>
         </w:tc>
@@ -5680,9 +5708,35 @@
                 <w:w w:val="125"/>
                 <w:sz w:val="15"/>
               </w:rPr>
-              <w:t>Band /</w:t>
               <w:br/>
-              <w:t>Freq</w:t>
+              <w:t xml:space="preserve">Band</w:t>
+            </w:r>
+          </w:p>
+        </w:tc>
+        <w:tc>
+          <w:tcPr>
+            <w:tcW w:w="694" w:type="dxa"/>
+            <w:shd w:val="clear" w:color="auto" w:fill="EEEEEE"/>
+          </w:tcPr>
+          <w:p>
+            <w:pPr>
+              <w:pStyle w:val="TableParagraph"/>
+              <w:spacing w:before="61"/>
+              <w:ind w:left="129"/>
+              <w:rPr>
+                <w:b/>
+                <w:sz w:val="15"/>
+              </w:rPr>
+            </w:pPr>
+            <w:r>
+              <w:rPr>
+                <w:b/>
+                <w:spacing w:val="-4"/>
+                <w:w w:val="125"/>
+                <w:sz w:val="15"/>
+              </w:rPr>
+              <w:br/>
+              <w:t xml:space="preserve">Freq (MHz)</w:t>
             </w:r>
           </w:p>
         </w:tc>
@@ -5946,6 +6000,11 @@
               <w:t>{du_band}</w:t>
             </w:r>
           </w:p>
+        </w:tc>
+        <w:tc>
+          <w:tcPr>
+            <w:tcW w:w="696" w:type="dxa"/>
+          </w:tcPr>
           <w:p>
             <w:pPr>
               <w:pStyle w:val="TableParagraph"/>
@@ -5961,7 +6020,7 @@
                 <w:w w:val="110"/>
                 <w:sz w:val="15"/>
               </w:rPr>
-              <w:t>{du_freq}</w:t>
+              <w:t xml:space="preserve">{du_freq}</w:t>
             </w:r>
           </w:p>
         </w:tc>
@@ -6120,6 +6179,11 @@
               <w:t>{et_band}</w:t>
             </w:r>
           </w:p>
+        </w:tc>
+        <w:tc>
+          <w:tcPr>
+            <w:tcW w:w="694" w:type="dxa"/>
+          </w:tcPr>
           <w:p>
             <w:pPr>
               <w:pStyle w:val="TableParagraph"/>
@@ -6135,7 +6199,7 @@
                 <w:w w:val="110"/>
                 <w:sz w:val="15"/>
               </w:rPr>
-              <w:t>{et_freq}</w:t>
+              <w:t xml:space="preserve">{et_freq}</w:t>
             </w:r>
           </w:p>
         </w:tc>
@@ -6435,6 +6499,8 @@
         <w:gridCol w:w="694"/>
         <w:gridCol w:w="790"/>
         <w:gridCol w:w="792"/>
+        <w:gridCol w:w="694"/>
+        <w:gridCol w:w="696"/>
       </w:tblGrid>
       <w:tr>
         <w:trPr>
@@ -6503,7 +6569,7 @@
         <w:tc>
           <w:tcPr>
             <w:tcW w:w="4409" w:type="dxa"/>
-            <w:gridSpan w:val="6"/>
+            <w:gridSpan w:val="7"/>
             <w:tcBorders>
               <w:top w:val="nil"/>
             </w:tcBorders>
@@ -6585,7 +6651,7 @@
         <w:tc>
           <w:tcPr>
             <w:tcW w:w="4413" w:type="dxa"/>
-            <w:gridSpan w:val="6"/>
+            <w:gridSpan w:val="7"/>
             <w:tcBorders>
               <w:top w:val="nil"/>
             </w:tcBorders>
@@ -6841,9 +6907,35 @@
                 <w:w w:val="125"/>
                 <w:sz w:val="15"/>
               </w:rPr>
-              <w:t>Band /</w:t>
               <w:br/>
-              <w:t>Freq</w:t>
+              <w:t xml:space="preserve">Band</w:t>
+            </w:r>
+          </w:p>
+        </w:tc>
+        <w:tc>
+          <w:tcPr>
+            <w:tcW w:w="696" w:type="dxa"/>
+            <w:shd w:val="clear" w:color="auto" w:fill="EEEEEE"/>
+          </w:tcPr>
+          <w:p>
+            <w:pPr>
+              <w:pStyle w:val="TableParagraph"/>
+              <w:spacing w:before="61"/>
+              <w:ind w:left="133"/>
+              <w:rPr>
+                <w:b/>
+                <w:sz w:val="15"/>
+              </w:rPr>
+            </w:pPr>
+            <w:r>
+              <w:rPr>
+                <w:b/>
+                <w:spacing w:val="-4"/>
+                <w:w w:val="125"/>
+                <w:sz w:val="15"/>
+              </w:rPr>
+              <w:br/>
+              <w:t xml:space="preserve">Freq (MHz)</w:t>
             </w:r>
           </w:p>
         </w:tc>
@@ -7091,9 +7183,35 @@
                 <w:w w:val="125"/>
                 <w:sz w:val="15"/>
               </w:rPr>
-              <w:t>Band /</w:t>
               <w:br/>
-              <w:t>Freq</w:t>
+              <w:t xml:space="preserve">Band</w:t>
+            </w:r>
+          </w:p>
+        </w:tc>
+        <w:tc>
+          <w:tcPr>
+            <w:tcW w:w="694" w:type="dxa"/>
+            <w:shd w:val="clear" w:color="auto" w:fill="EEEEEE"/>
+          </w:tcPr>
+          <w:p>
+            <w:pPr>
+              <w:pStyle w:val="TableParagraph"/>
+              <w:spacing w:before="61"/>
+              <w:ind w:left="129"/>
+              <w:rPr>
+                <w:b/>
+                <w:sz w:val="15"/>
+              </w:rPr>
+            </w:pPr>
+            <w:r>
+              <w:rPr>
+                <w:b/>
+                <w:spacing w:val="-4"/>
+                <w:w w:val="125"/>
+                <w:sz w:val="15"/>
+              </w:rPr>
+              <w:br/>
+              <w:t xml:space="preserve">Freq (MHz)</w:t>
             </w:r>
           </w:p>
         </w:tc>
@@ -7325,6 +7443,11 @@
               <w:t>{du_band}</w:t>
             </w:r>
           </w:p>
+        </w:tc>
+        <w:tc>
+          <w:tcPr>
+            <w:tcW w:w="696" w:type="dxa"/>
+          </w:tcPr>
           <w:p>
             <w:pPr>
               <w:pStyle w:val="TableParagraph"/>
@@ -7340,7 +7463,7 @@
                 <w:w w:val="110"/>
                 <w:sz w:val="15"/>
               </w:rPr>
-              <w:t>{du_freq}</w:t>
+              <w:t xml:space="preserve">{du_freq}</w:t>
             </w:r>
           </w:p>
         </w:tc>
@@ -7499,6 +7622,11 @@
               <w:t>{et_band}</w:t>
             </w:r>
           </w:p>
+        </w:tc>
+        <w:tc>
+          <w:tcPr>
+            <w:tcW w:w="694" w:type="dxa"/>
+          </w:tcPr>
           <w:p>
             <w:pPr>
               <w:pStyle w:val="TableParagraph"/>
@@ -7514,7 +7642,7 @@
                 <w:w w:val="110"/>
                 <w:sz w:val="15"/>
               </w:rPr>
-              <w:t>{et_freq}</w:t>
+              <w:t xml:space="preserve">{et_freq}</w:t>
             </w:r>
           </w:p>
         </w:tc>
@@ -7728,6 +7856,8 @@
         <w:gridCol w:w="694"/>
         <w:gridCol w:w="790"/>
         <w:gridCol w:w="792"/>
+        <w:gridCol w:w="694"/>
+        <w:gridCol w:w="696"/>
       </w:tblGrid>
       <w:tr>
         <w:trPr>
@@ -7796,7 +7926,7 @@
         <w:tc>
           <w:tcPr>
             <w:tcW w:w="4409" w:type="dxa"/>
-            <w:gridSpan w:val="6"/>
+            <w:gridSpan w:val="7"/>
             <w:tcBorders>
               <w:top w:val="nil"/>
             </w:tcBorders>
@@ -7878,7 +8008,7 @@
         <w:tc>
           <w:tcPr>
             <w:tcW w:w="4413" w:type="dxa"/>
-            <w:gridSpan w:val="6"/>
+            <w:gridSpan w:val="7"/>
             <w:tcBorders>
               <w:top w:val="nil"/>
             </w:tcBorders>
@@ -8134,9 +8264,35 @@
                 <w:w w:val="125"/>
                 <w:sz w:val="15"/>
               </w:rPr>
-              <w:t>Band /</w:t>
               <w:br/>
-              <w:t>Freq</w:t>
+              <w:t xml:space="preserve">Band</w:t>
+            </w:r>
+          </w:p>
+        </w:tc>
+        <w:tc>
+          <w:tcPr>
+            <w:tcW w:w="696" w:type="dxa"/>
+            <w:shd w:val="clear" w:color="auto" w:fill="EEEEEE"/>
+          </w:tcPr>
+          <w:p>
+            <w:pPr>
+              <w:pStyle w:val="TableParagraph"/>
+              <w:spacing w:before="61"/>
+              <w:ind w:left="133"/>
+              <w:rPr>
+                <w:b/>
+                <w:sz w:val="15"/>
+              </w:rPr>
+            </w:pPr>
+            <w:r>
+              <w:rPr>
+                <w:b/>
+                <w:spacing w:val="-4"/>
+                <w:w w:val="125"/>
+                <w:sz w:val="15"/>
+              </w:rPr>
+              <w:br/>
+              <w:t xml:space="preserve">Freq (MHz)</w:t>
             </w:r>
           </w:p>
         </w:tc>
@@ -8384,9 +8540,35 @@
                 <w:w w:val="125"/>
                 <w:sz w:val="15"/>
               </w:rPr>
-              <w:t>Band /</w:t>
               <w:br/>
-              <w:t>Freq</w:t>
+              <w:t xml:space="preserve">Band</w:t>
+            </w:r>
+          </w:p>
+        </w:tc>
+        <w:tc>
+          <w:tcPr>
+            <w:tcW w:w="694" w:type="dxa"/>
+            <w:shd w:val="clear" w:color="auto" w:fill="EEEEEE"/>
+          </w:tcPr>
+          <w:p>
+            <w:pPr>
+              <w:pStyle w:val="TableParagraph"/>
+              <w:spacing w:before="61"/>
+              <w:ind w:left="129"/>
+              <w:rPr>
+                <w:b/>
+                <w:sz w:val="15"/>
+              </w:rPr>
+            </w:pPr>
+            <w:r>
+              <w:rPr>
+                <w:b/>
+                <w:spacing w:val="-4"/>
+                <w:w w:val="125"/>
+                <w:sz w:val="15"/>
+              </w:rPr>
+              <w:br/>
+              <w:t xml:space="preserve">Freq (MHz)</w:t>
             </w:r>
           </w:p>
         </w:tc>
@@ -8613,6 +8795,11 @@
               <w:t>{du_band}</w:t>
             </w:r>
           </w:p>
+        </w:tc>
+        <w:tc>
+          <w:tcPr>
+            <w:tcW w:w="696" w:type="dxa"/>
+          </w:tcPr>
           <w:p>
             <w:pPr>
               <w:pStyle w:val="TableParagraph"/>
@@ -8629,7 +8816,7 @@
                 <w:w w:val="110"/>
                 <w:sz w:val="15"/>
               </w:rPr>
-              <w:t>{du_freq}</w:t>
+              <w:t xml:space="preserve">{du_freq}</w:t>
             </w:r>
           </w:p>
         </w:tc>
@@ -8779,6 +8966,11 @@
               <w:t>{et_band}</w:t>
             </w:r>
           </w:p>
+        </w:tc>
+        <w:tc>
+          <w:tcPr>
+            <w:tcW w:w="694" w:type="dxa"/>
+          </w:tcPr>
           <w:p>
             <w:pPr>
               <w:pStyle w:val="TableParagraph"/>
@@ -8795,7 +8987,7 @@
                 <w:w w:val="110"/>
                 <w:sz w:val="15"/>
               </w:rPr>
-              <w:t>{et_freq}</w:t>
+              <w:t xml:space="preserve">{et_freq}</w:t>
             </w:r>
           </w:p>
         </w:tc>

</xml_diff>